<commit_message>
Update Modelos y Matriz de Trazabilidad
Matriz casi acabada y modelos actualizados
</commit_message>
<xml_diff>
--- a/Documentacion/Matriz de Trazabilidad.docx
+++ b/Documentacion/Matriz de Trazabilidad.docx
@@ -1742,7 +1742,7 @@
           <w:szCs w:val="22"/>
         </w:rPr>
         <w:lastRenderedPageBreak/>
-        <w:t>Módulo de Eventos Recurrentes</w:t>
+        <w:t>Módulo de Disponibilidad de Usuarios y Gestión de Tiempos</w:t>
       </w:r>
     </w:p>
     <w:tbl>
@@ -1923,11 +1923,8 @@
           </w:tcPr>
           <w:p>
             <w:pPr>
-              <w:rPr>
-                <w:rFonts w:ascii="Arial" w:hAnsi="Arial" w:cs="Arial"/>
-                <w:sz w:val="22"/>
-                <w:szCs w:val="22"/>
-              </w:rPr>
+              <w:pStyle w:val="NormalWeb"/>
+              <w:spacing w:after="0"/>
             </w:pPr>
             <w:r>
               <w:rPr>
@@ -1936,7 +1933,7 @@
                 <w:sz w:val="22"/>
                 <w:szCs w:val="22"/>
               </w:rPr>
-              <w:t xml:space="preserve">Definir la entidad contenedora </w:t>
+              <w:t xml:space="preserve">Definir la entidad disponibilidades vinculada al perfil del usuario y el catálogo </w:t>
             </w:r>
             <w:proofErr w:type="spellStart"/>
             <w:r>
@@ -1946,7 +1943,7 @@
                 <w:sz w:val="22"/>
                 <w:szCs w:val="22"/>
               </w:rPr>
-              <w:t>series_eventos</w:t>
+              <w:t>tipos_disponibilidad</w:t>
             </w:r>
             <w:proofErr w:type="spellEnd"/>
             <w:r>
@@ -1956,7 +1953,7 @@
                 <w:sz w:val="22"/>
                 <w:szCs w:val="22"/>
               </w:rPr>
-              <w:t xml:space="preserve"> con reglas de periodicidad, fechas de inicio y finalización.</w:t>
+              <w:t xml:space="preserve"> con sus atributos obligatorios de fecha y horas.</w:t>
             </w:r>
           </w:p>
         </w:tc>
@@ -2044,9 +2041,8 @@
                 <w:sz w:val="22"/>
                 <w:szCs w:val="22"/>
               </w:rPr>
-              <w:t xml:space="preserve">Diseñar la relación de uno a muchos entre </w:t>
-            </w:r>
-            <w:proofErr w:type="spellStart"/>
+              <w:t xml:space="preserve">Estructurar las tablas relacionales para el control de disponibilidades y su clave </w:t>
+            </w:r>
             <w:r>
               <w:rPr>
                 <w:rFonts w:ascii="Arial" w:hAnsi="Arial" w:cs="Arial"/>
@@ -2054,9 +2050,8 @@
                 <w:sz w:val="22"/>
                 <w:szCs w:val="22"/>
               </w:rPr>
-              <w:t>series_eventos</w:t>
-            </w:r>
-            <w:proofErr w:type="spellEnd"/>
+              <w:t>foránea</w:t>
+            </w:r>
             <w:r>
               <w:rPr>
                 <w:rFonts w:ascii="Arial" w:hAnsi="Arial" w:cs="Arial"/>
@@ -2064,31 +2059,31 @@
                 <w:sz w:val="22"/>
                 <w:szCs w:val="22"/>
               </w:rPr>
-              <w:t xml:space="preserve"> y las ocurrencias individuales de eventos.</w:t>
+              <w:t xml:space="preserve"> hacia usuarios.</w:t>
             </w:r>
           </w:p>
         </w:tc>
         <w:tc>
           <w:tcPr>
             <w:tcW w:w="1558" w:type="dxa"/>
-            <w:shd w:val="clear" w:color="auto" w:fill="EE0000"/>
-            <w:vAlign w:val="center"/>
-          </w:tcPr>
-          <w:p>
-            <w:pPr>
-              <w:rPr>
-                <w:rFonts w:ascii="Arial" w:hAnsi="Arial" w:cs="Arial"/>
-                <w:sz w:val="22"/>
-                <w:szCs w:val="22"/>
-              </w:rPr>
-            </w:pPr>
-            <w:r>
-              <w:rPr>
-                <w:rFonts w:ascii="Arial" w:hAnsi="Arial" w:cs="Arial"/>
-                <w:sz w:val="22"/>
-                <w:szCs w:val="22"/>
-              </w:rPr>
-              <w:t>Sin iniciar</w:t>
+            <w:shd w:val="clear" w:color="auto" w:fill="00B050"/>
+            <w:vAlign w:val="center"/>
+          </w:tcPr>
+          <w:p>
+            <w:pPr>
+              <w:rPr>
+                <w:rFonts w:ascii="Arial" w:hAnsi="Arial" w:cs="Arial"/>
+                <w:sz w:val="22"/>
+                <w:szCs w:val="22"/>
+              </w:rPr>
+            </w:pPr>
+            <w:r>
+              <w:rPr>
+                <w:rFonts w:ascii="Arial" w:hAnsi="Arial" w:cs="Arial"/>
+                <w:sz w:val="22"/>
+                <w:szCs w:val="22"/>
+              </w:rPr>
+              <w:t>Completado</w:t>
             </w:r>
           </w:p>
         </w:tc>
@@ -2152,51 +2147,31 @@
                 <w:sz w:val="22"/>
                 <w:szCs w:val="22"/>
               </w:rPr>
-              <w:t xml:space="preserve">Implementar la estructura de la tabla </w:t>
-            </w:r>
-            <w:proofErr w:type="spellStart"/>
-            <w:r>
-              <w:rPr>
-                <w:rFonts w:ascii="Arial" w:hAnsi="Arial" w:cs="Arial"/>
-                <w:color w:val="000000"/>
-                <w:sz w:val="22"/>
-                <w:szCs w:val="22"/>
-              </w:rPr>
-              <w:t>series_eventos</w:t>
-            </w:r>
-            <w:proofErr w:type="spellEnd"/>
-            <w:r>
-              <w:rPr>
-                <w:rFonts w:ascii="Arial" w:hAnsi="Arial" w:cs="Arial"/>
-                <w:color w:val="000000"/>
-                <w:sz w:val="22"/>
-                <w:szCs w:val="22"/>
-              </w:rPr>
-              <w:t xml:space="preserve"> y su ligadura referencial en PostgreSQL.</w:t>
+              <w:t>Codificar la creación de tablas y catálogos en PostgreSQL asegurando la integridad de las franjas temporales.</w:t>
             </w:r>
           </w:p>
         </w:tc>
         <w:tc>
           <w:tcPr>
             <w:tcW w:w="1558" w:type="dxa"/>
-            <w:shd w:val="clear" w:color="auto" w:fill="EE0000"/>
-            <w:vAlign w:val="center"/>
-          </w:tcPr>
-          <w:p>
-            <w:pPr>
-              <w:rPr>
-                <w:rFonts w:ascii="Arial" w:hAnsi="Arial" w:cs="Arial"/>
-                <w:sz w:val="22"/>
-                <w:szCs w:val="22"/>
-              </w:rPr>
-            </w:pPr>
-            <w:r>
-              <w:rPr>
-                <w:rFonts w:ascii="Arial" w:hAnsi="Arial" w:cs="Arial"/>
-                <w:sz w:val="22"/>
-                <w:szCs w:val="22"/>
-              </w:rPr>
-              <w:t>Sin iniciar</w:t>
+            <w:shd w:val="clear" w:color="auto" w:fill="00B050"/>
+            <w:vAlign w:val="center"/>
+          </w:tcPr>
+          <w:p>
+            <w:pPr>
+              <w:rPr>
+                <w:rFonts w:ascii="Arial" w:hAnsi="Arial" w:cs="Arial"/>
+                <w:sz w:val="22"/>
+                <w:szCs w:val="22"/>
+              </w:rPr>
+            </w:pPr>
+            <w:r>
+              <w:rPr>
+                <w:rFonts w:ascii="Arial" w:hAnsi="Arial" w:cs="Arial"/>
+                <w:sz w:val="22"/>
+                <w:szCs w:val="22"/>
+              </w:rPr>
+              <w:t>Completado</w:t>
             </w:r>
           </w:p>
         </w:tc>
@@ -2260,31 +2235,31 @@
                 <w:sz w:val="22"/>
                 <w:szCs w:val="22"/>
               </w:rPr>
-              <w:t>Diseñar formularios en la GUI para la administración y visualización estructurada de las series periódicas.</w:t>
+              <w:t>Desarrollar el módulo en la interfaz para que los usuarios administren sus periodos libres u ocupados mediante operaciones CRUD completas.</w:t>
             </w:r>
           </w:p>
         </w:tc>
         <w:tc>
           <w:tcPr>
             <w:tcW w:w="1558" w:type="dxa"/>
-            <w:shd w:val="clear" w:color="auto" w:fill="EE0000"/>
-            <w:vAlign w:val="center"/>
-          </w:tcPr>
-          <w:p>
-            <w:pPr>
-              <w:rPr>
-                <w:rFonts w:ascii="Arial" w:hAnsi="Arial" w:cs="Arial"/>
-                <w:sz w:val="22"/>
-                <w:szCs w:val="22"/>
-              </w:rPr>
-            </w:pPr>
-            <w:r>
-              <w:rPr>
-                <w:rFonts w:ascii="Arial" w:hAnsi="Arial" w:cs="Arial"/>
-                <w:sz w:val="22"/>
-                <w:szCs w:val="22"/>
-              </w:rPr>
-              <w:t>Sin iniciar</w:t>
+            <w:shd w:val="clear" w:color="auto" w:fill="00B050"/>
+            <w:vAlign w:val="center"/>
+          </w:tcPr>
+          <w:p>
+            <w:pPr>
+              <w:rPr>
+                <w:rFonts w:ascii="Arial" w:hAnsi="Arial" w:cs="Arial"/>
+                <w:sz w:val="22"/>
+                <w:szCs w:val="22"/>
+              </w:rPr>
+            </w:pPr>
+            <w:r>
+              <w:rPr>
+                <w:rFonts w:ascii="Arial" w:hAnsi="Arial" w:cs="Arial"/>
+                <w:sz w:val="22"/>
+                <w:szCs w:val="22"/>
+              </w:rPr>
+              <w:t>Completado</w:t>
             </w:r>
           </w:p>
         </w:tc>
@@ -2356,31 +2331,31 @@
                 <w:sz w:val="22"/>
                 <w:szCs w:val="22"/>
               </w:rPr>
-              <w:t>Preparar las consultas e instrucciones de manipulación de fechas en el motor de base de datos para procesar el desglose de ocurrencias periódicas.</w:t>
+              <w:t>Estructurar las consultas analíticas en el motor de base de datos para la detección de cruces o traslapes temporales entre eventos y disponibilidades.</w:t>
             </w:r>
           </w:p>
         </w:tc>
         <w:tc>
           <w:tcPr>
             <w:tcW w:w="1558" w:type="dxa"/>
-            <w:shd w:val="clear" w:color="auto" w:fill="EE0000"/>
-            <w:vAlign w:val="center"/>
-          </w:tcPr>
-          <w:p>
-            <w:pPr>
-              <w:rPr>
-                <w:rFonts w:ascii="Arial" w:hAnsi="Arial" w:cs="Arial"/>
-                <w:sz w:val="22"/>
-                <w:szCs w:val="22"/>
-              </w:rPr>
-            </w:pPr>
-            <w:r>
-              <w:rPr>
-                <w:rFonts w:ascii="Arial" w:hAnsi="Arial" w:cs="Arial"/>
-                <w:sz w:val="22"/>
-                <w:szCs w:val="22"/>
-              </w:rPr>
-              <w:t>Sin iniciar</w:t>
+            <w:shd w:val="clear" w:color="auto" w:fill="00B050"/>
+            <w:vAlign w:val="center"/>
+          </w:tcPr>
+          <w:p>
+            <w:pPr>
+              <w:rPr>
+                <w:rFonts w:ascii="Arial" w:hAnsi="Arial" w:cs="Arial"/>
+                <w:sz w:val="22"/>
+                <w:szCs w:val="22"/>
+              </w:rPr>
+            </w:pPr>
+            <w:r>
+              <w:rPr>
+                <w:rFonts w:ascii="Arial" w:hAnsi="Arial" w:cs="Arial"/>
+                <w:sz w:val="22"/>
+                <w:szCs w:val="22"/>
+              </w:rPr>
+              <w:t>Completado</w:t>
             </w:r>
           </w:p>
         </w:tc>
@@ -2444,31 +2419,51 @@
                 <w:sz w:val="22"/>
                 <w:szCs w:val="22"/>
               </w:rPr>
-              <w:t>Incorporar en la interfaz gráfica un mecanismo de control y botones de acción en Python para configurar, insertar y administrar el desglose de los eventos hijos.</w:t>
-            </w:r>
+              <w:t xml:space="preserve">Integrar las salidas analíticas en la GUI para determinar automáticamente usuarios libres y disponibles en un rango horario </w:t>
+            </w:r>
+            <w:proofErr w:type="gramStart"/>
+            <w:r>
+              <w:rPr>
+                <w:rFonts w:ascii="Arial" w:hAnsi="Arial" w:cs="Arial"/>
+                <w:color w:val="000000"/>
+                <w:sz w:val="22"/>
+                <w:szCs w:val="22"/>
+              </w:rPr>
+              <w:t>específico.</w:t>
+            </w:r>
+            <w:r>
+              <w:rPr>
+                <w:rFonts w:ascii="Arial" w:hAnsi="Arial" w:cs="Arial"/>
+                <w:color w:val="000000"/>
+                <w:sz w:val="22"/>
+                <w:szCs w:val="22"/>
+              </w:rPr>
+              <w:t>.</w:t>
+            </w:r>
+            <w:proofErr w:type="gramEnd"/>
           </w:p>
         </w:tc>
         <w:tc>
           <w:tcPr>
             <w:tcW w:w="1558" w:type="dxa"/>
-            <w:shd w:val="clear" w:color="auto" w:fill="EE0000"/>
-            <w:vAlign w:val="center"/>
-          </w:tcPr>
-          <w:p>
-            <w:pPr>
-              <w:rPr>
-                <w:rFonts w:ascii="Arial" w:hAnsi="Arial" w:cs="Arial"/>
-                <w:sz w:val="22"/>
-                <w:szCs w:val="22"/>
-              </w:rPr>
-            </w:pPr>
-            <w:r>
-              <w:rPr>
-                <w:rFonts w:ascii="Arial" w:hAnsi="Arial" w:cs="Arial"/>
-                <w:sz w:val="22"/>
-                <w:szCs w:val="22"/>
-              </w:rPr>
-              <w:t>Sin iniciar</w:t>
+            <w:shd w:val="clear" w:color="auto" w:fill="00B050"/>
+            <w:vAlign w:val="center"/>
+          </w:tcPr>
+          <w:p>
+            <w:pPr>
+              <w:rPr>
+                <w:rFonts w:ascii="Arial" w:hAnsi="Arial" w:cs="Arial"/>
+                <w:sz w:val="22"/>
+                <w:szCs w:val="22"/>
+              </w:rPr>
+            </w:pPr>
+            <w:r>
+              <w:rPr>
+                <w:rFonts w:ascii="Arial" w:hAnsi="Arial" w:cs="Arial"/>
+                <w:sz w:val="22"/>
+                <w:szCs w:val="22"/>
+              </w:rPr>
+              <w:t>Completado</w:t>
             </w:r>
           </w:p>
         </w:tc>
@@ -3687,7 +3682,7 @@
               <w:bottom w:val="single" w:sz="6" w:space="0" w:color="C4C7C5"/>
               <w:right w:val="single" w:sz="6" w:space="0" w:color="C4C7C5"/>
             </w:tcBorders>
-            <w:shd w:val="clear" w:color="auto" w:fill="EE0000"/>
+            <w:shd w:val="clear" w:color="auto" w:fill="00B050"/>
             <w:vAlign w:val="center"/>
           </w:tcPr>
           <w:p>
@@ -3706,7 +3701,7 @@
                 <w:sz w:val="22"/>
                 <w:szCs w:val="22"/>
               </w:rPr>
-              <w:t>Sin iniciar</w:t>
+              <w:t>Completado</w:t>
             </w:r>
           </w:p>
         </w:tc>
@@ -3819,7 +3814,7 @@
               <w:bottom w:val="single" w:sz="6" w:space="0" w:color="C4C7C5"/>
               <w:right w:val="single" w:sz="6" w:space="0" w:color="C4C7C5"/>
             </w:tcBorders>
-            <w:shd w:val="clear" w:color="auto" w:fill="EE0000"/>
+            <w:shd w:val="clear" w:color="auto" w:fill="00B050"/>
             <w:vAlign w:val="center"/>
           </w:tcPr>
           <w:p>
@@ -3838,7 +3833,7 @@
                 <w:sz w:val="22"/>
                 <w:szCs w:val="22"/>
               </w:rPr>
-              <w:t>Sin iniciar</w:t>
+              <w:t>Completado</w:t>
             </w:r>
           </w:p>
         </w:tc>
@@ -5108,6 +5103,22 @@
       </w:tblBorders>
     </w:tblPr>
   </w:style>
+  <w:style w:type="paragraph" w:styleId="NormalWeb">
+    <w:name w:val="Normal (Web)"/>
+    <w:basedOn w:val="Normal"/>
+    <w:uiPriority w:val="99"/>
+    <w:unhideWhenUsed/>
+    <w:rsid w:val="00B23964"/>
+    <w:pPr>
+      <w:spacing w:before="100" w:beforeAutospacing="1" w:after="100" w:afterAutospacing="1" w:line="240" w:lineRule="auto"/>
+    </w:pPr>
+    <w:rPr>
+      <w:rFonts w:ascii="Times New Roman" w:eastAsia="Times New Roman" w:hAnsi="Times New Roman" w:cs="Times New Roman"/>
+      <w:kern w:val="0"/>
+      <w:lang w:eastAsia="es-CR"/>
+      <w14:ligatures w14:val="none"/>
+    </w:rPr>
+  </w:style>
 </w:styles>
 </file>
 

</xml_diff>